<commit_message>
docs(meeting-minutes): MEETING-TABS-2026-001 R16 status, review and evidence
Co-Authored-By: Claude Opus 5.5 <noreply@anthropic.com>
</commit_message>
<xml_diff>
--- a/docs/workflow/MEETING-TABS-2026-001-evidence/r15-sample-with-photos.docx
+++ b/docs/workflow/MEETING-TABS-2026-001-evidence/r15-sample-with-photos.docx
@@ -86,77 +86,84 @@
       </w:r>
     </w:p>
     <w:p/>
+    <w:p>
+      <w:pPr>
+        <w:keepNext/>
+        <w:spacing w:before="200" w:after="80"/>
+      </w:pPr>
+      <w:r>
+        <w:rPr>
+          <w:rFonts w:ascii="Calibri" w:hAnsi="Calibri" w:eastAsia="標楷體"/>
+          <w:b/>
+          <w:sz w:val="23"/>
+        </w:rPr>
+        <w:t>1. 基本資料  Basic Information</w:t>
+      </w:r>
+    </w:p>
     <w:tbl>
       <w:tblPr>
+        <w:tblStyle w:val="TableGrid"/>
         <w:tblW w:type="auto" w:w="0"/>
-        <w:tblLayout w:type="autofit"/>
+        <w:tblLayout w:type="fixed"/>
         <w:tblLook w:firstColumn="1" w:firstRow="1" w:lastColumn="0" w:lastRow="0" w:noHBand="0" w:noVBand="1" w:val="04A0"/>
       </w:tblPr>
       <w:tblGrid>
-        <w:gridCol w:w="9866"/>
+        <w:gridCol w:w="1644"/>
+        <w:gridCol w:w="1814"/>
+        <w:gridCol w:w="3175"/>
+        <w:gridCol w:w="1361"/>
+        <w:gridCol w:w="1871"/>
       </w:tblGrid>
       <w:tr>
         <w:tc>
           <w:tcPr>
-            <w:tcW w:type="dxa" w:w="9866"/>
-            <w:shd w:val="clear" w:fill="D9D9D9"/>
+            <w:tcW w:type="dxa" w:w="1644"/>
             <w:vAlign w:val="center"/>
           </w:tcPr>
           <w:p>
+            <w:pPr>
+              <w:spacing w:before="20" w:after="20"/>
+              <w:jc w:val="center"/>
+            </w:pPr>
             <w:r>
               <w:rPr>
                 <w:rFonts w:ascii="Calibri" w:hAnsi="Calibri" w:eastAsia="標楷體"/>
                 <w:b/>
-                <w:sz w:val="23"/>
+                <w:sz w:val="18"/>
               </w:rPr>
-              <w:t>1. 基本資料  Basic Information</w:t>
+              <w:t>主題</w:t>
             </w:r>
           </w:p>
-        </w:tc>
-      </w:tr>
-    </w:tbl>
-    <w:tbl>
-      <w:tblPr>
-        <w:tblStyle w:val="TableGrid"/>
-        <w:tblW w:type="auto" w:w="0"/>
-        <w:tblLook w:firstColumn="1" w:firstRow="1" w:lastColumn="0" w:lastRow="0" w:noHBand="0" w:noVBand="1" w:val="04A0"/>
-      </w:tblPr>
-      <w:tblGrid>
-        <w:gridCol w:w="2466"/>
-        <w:gridCol w:w="2466"/>
-        <w:gridCol w:w="2466"/>
-        <w:gridCol w:w="2466"/>
-      </w:tblGrid>
-      <w:tr>
-        <w:tc>
-          <w:tcPr>
-            <w:tcW w:type="dxa" w:w="2466"/>
-            <w:shd w:val="clear" w:fill="F2F2F2"/>
-            <w:vAlign w:val="center"/>
-          </w:tcPr>
           <w:p>
+            <w:pPr>
+              <w:spacing w:before="20" w:after="20"/>
+              <w:jc w:val="center"/>
+            </w:pPr>
             <w:r>
               <w:rPr>
                 <w:rFonts w:ascii="Calibri" w:hAnsi="Calibri" w:eastAsia="標楷體"/>
                 <w:b/>
-                <w:sz w:val="17"/>
+                <w:sz w:val="18"/>
               </w:rPr>
-              <w:t>主題</w:t>
-              <w:br/>
               <w:t>SUBJECT</w:t>
             </w:r>
           </w:p>
         </w:tc>
         <w:tc>
           <w:tcPr>
-            <w:tcW w:type="dxa" w:w="7398"/>
-            <w:gridSpan w:val="3"/>
+            <w:tcW w:type="dxa" w:w="8221"/>
+            <w:gridSpan w:val="4"/>
             <w:vAlign w:val="center"/>
           </w:tcPr>
           <w:p>
+            <w:pPr>
+              <w:spacing w:before="20" w:after="20"/>
+              <w:jc w:val="center"/>
+            </w:pPr>
             <w:r>
               <w:rPr>
                 <w:rFonts w:ascii="Calibri" w:hAnsi="Calibri" w:eastAsia="標楷體"/>
+                <w:b w:val="0"/>
                 <w:sz w:val="20"/>
               </w:rPr>
               <w:t>Weekly site coordination meeting</w:t>
@@ -167,32 +174,53 @@
       <w:tr>
         <w:tc>
           <w:tcPr>
-            <w:tcW w:type="dxa" w:w="2466"/>
-            <w:shd w:val="clear" w:fill="F2F2F2"/>
+            <w:tcW w:type="dxa" w:w="1644"/>
             <w:vAlign w:val="center"/>
           </w:tcPr>
           <w:p>
+            <w:pPr>
+              <w:spacing w:before="20" w:after="20"/>
+              <w:jc w:val="center"/>
+            </w:pPr>
             <w:r>
               <w:rPr>
                 <w:rFonts w:ascii="Calibri" w:hAnsi="Calibri" w:eastAsia="標楷體"/>
                 <w:b/>
-                <w:sz w:val="17"/>
+                <w:sz w:val="18"/>
               </w:rPr>
               <w:t>日期／類型</w:t>
-              <w:br/>
+            </w:r>
+          </w:p>
+          <w:p>
+            <w:pPr>
+              <w:spacing w:before="20" w:after="20"/>
+              <w:jc w:val="center"/>
+            </w:pPr>
+            <w:r>
+              <w:rPr>
+                <w:rFonts w:ascii="Calibri" w:hAnsi="Calibri" w:eastAsia="標楷體"/>
+                <w:b/>
+                <w:sz w:val="18"/>
+              </w:rPr>
               <w:t>DATE / TYPE</w:t>
             </w:r>
           </w:p>
         </w:tc>
         <w:tc>
           <w:tcPr>
-            <w:tcW w:type="dxa" w:w="2466"/>
+            <w:tcW w:type="dxa" w:w="4989"/>
+            <w:gridSpan w:val="2"/>
             <w:vAlign w:val="center"/>
           </w:tcPr>
           <w:p>
+            <w:pPr>
+              <w:spacing w:before="20" w:after="20"/>
+              <w:jc w:val="center"/>
+            </w:pPr>
             <w:r>
               <w:rPr>
                 <w:rFonts w:ascii="Calibri" w:hAnsi="Calibri" w:eastAsia="標楷體"/>
+                <w:b w:val="0"/>
                 <w:sz w:val="20"/>
               </w:rPr>
               <w:t>28 Jul 2026　Weekly</w:t>
@@ -201,32 +229,52 @@
         </w:tc>
         <w:tc>
           <w:tcPr>
-            <w:tcW w:type="dxa" w:w="2466"/>
-            <w:shd w:val="clear" w:fill="F2F2F2"/>
+            <w:tcW w:type="dxa" w:w="1361"/>
             <w:vAlign w:val="center"/>
           </w:tcPr>
           <w:p>
+            <w:pPr>
+              <w:spacing w:before="20" w:after="20"/>
+              <w:jc w:val="center"/>
+            </w:pPr>
             <w:r>
               <w:rPr>
                 <w:rFonts w:ascii="Calibri" w:hAnsi="Calibri" w:eastAsia="標楷體"/>
                 <w:b/>
-                <w:sz w:val="17"/>
+                <w:sz w:val="18"/>
               </w:rPr>
               <w:t>廠商</w:t>
-              <w:br/>
+            </w:r>
+          </w:p>
+          <w:p>
+            <w:pPr>
+              <w:spacing w:before="20" w:after="20"/>
+              <w:jc w:val="center"/>
+            </w:pPr>
+            <w:r>
+              <w:rPr>
+                <w:rFonts w:ascii="Calibri" w:hAnsi="Calibri" w:eastAsia="標楷體"/>
+                <w:b/>
+                <w:sz w:val="18"/>
+              </w:rPr>
               <w:t>CONTRACTOR</w:t>
             </w:r>
           </w:p>
         </w:tc>
         <w:tc>
           <w:tcPr>
-            <w:tcW w:type="dxa" w:w="2466"/>
+            <w:tcW w:type="dxa" w:w="1871"/>
             <w:vAlign w:val="center"/>
           </w:tcPr>
           <w:p>
+            <w:pPr>
+              <w:spacing w:before="20" w:after="20"/>
+              <w:jc w:val="center"/>
+            </w:pPr>
             <w:r>
               <w:rPr>
                 <w:rFonts w:ascii="Calibri" w:hAnsi="Calibri" w:eastAsia="標楷體"/>
+                <w:b w:val="0"/>
                 <w:sz w:val="20"/>
               </w:rPr>
               <w:t>Hailong Construction</w:t>
@@ -237,66 +285,121 @@
       <w:tr>
         <w:tc>
           <w:tcPr>
-            <w:tcW w:type="dxa" w:w="2466"/>
-            <w:shd w:val="clear" w:fill="F2F2F2"/>
+            <w:tcW w:type="dxa" w:w="1644"/>
             <w:vAlign w:val="center"/>
           </w:tcPr>
           <w:p>
+            <w:pPr>
+              <w:spacing w:before="20" w:after="20"/>
+              <w:jc w:val="center"/>
+            </w:pPr>
             <w:r>
               <w:rPr>
                 <w:rFonts w:ascii="Calibri" w:hAnsi="Calibri" w:eastAsia="標楷體"/>
                 <w:b/>
-                <w:sz w:val="17"/>
+                <w:sz w:val="18"/>
               </w:rPr>
               <w:t>地點與時間</w:t>
-              <w:br/>
+            </w:r>
+          </w:p>
+          <w:p>
+            <w:pPr>
+              <w:spacing w:before="20" w:after="20"/>
+              <w:jc w:val="center"/>
+            </w:pPr>
+            <w:r>
+              <w:rPr>
+                <w:rFonts w:ascii="Calibri" w:hAnsi="Calibri" w:eastAsia="標楷體"/>
+                <w:b/>
+                <w:sz w:val="18"/>
+              </w:rPr>
               <w:t>VENUE &amp; TIME</w:t>
             </w:r>
           </w:p>
         </w:tc>
         <w:tc>
           <w:tcPr>
-            <w:tcW w:type="dxa" w:w="2466"/>
+            <w:tcW w:type="dxa" w:w="4989"/>
+            <w:gridSpan w:val="2"/>
             <w:vAlign w:val="center"/>
           </w:tcPr>
           <w:p>
+            <w:pPr>
+              <w:spacing w:before="20" w:after="20"/>
+              <w:jc w:val="center"/>
+            </w:pPr>
             <w:r>
               <w:rPr>
                 <w:rFonts w:ascii="Calibri" w:hAnsi="Calibri" w:eastAsia="標楷體"/>
+                <w:b w:val="0"/>
                 <w:sz w:val="20"/>
               </w:rPr>
-              <w:t>Site office　15:00 ~ 17:15</w:t>
+              <w:t>Site office</w:t>
+            </w:r>
+          </w:p>
+          <w:p>
+            <w:pPr>
+              <w:spacing w:before="20" w:after="20"/>
+              <w:jc w:val="center"/>
+            </w:pPr>
+            <w:r>
+              <w:rPr>
+                <w:rFonts w:ascii="Calibri" w:hAnsi="Calibri" w:eastAsia="標楷體"/>
+                <w:b w:val="0"/>
+                <w:sz w:val="20"/>
+              </w:rPr>
+              <w:t>15:00 ~ 17:15</w:t>
             </w:r>
           </w:p>
         </w:tc>
         <w:tc>
           <w:tcPr>
-            <w:tcW w:type="dxa" w:w="2466"/>
-            <w:shd w:val="clear" w:fill="F2F2F2"/>
+            <w:tcW w:type="dxa" w:w="1361"/>
             <w:vAlign w:val="center"/>
           </w:tcPr>
           <w:p>
+            <w:pPr>
+              <w:spacing w:before="20" w:after="20"/>
+              <w:jc w:val="center"/>
+            </w:pPr>
             <w:r>
               <w:rPr>
                 <w:rFonts w:ascii="Calibri" w:hAnsi="Calibri" w:eastAsia="標楷體"/>
                 <w:b/>
-                <w:sz w:val="17"/>
+                <w:sz w:val="18"/>
               </w:rPr>
               <w:t>記錄人</w:t>
-              <w:br/>
+            </w:r>
+          </w:p>
+          <w:p>
+            <w:pPr>
+              <w:spacing w:before="20" w:after="20"/>
+              <w:jc w:val="center"/>
+            </w:pPr>
+            <w:r>
+              <w:rPr>
+                <w:rFonts w:ascii="Calibri" w:hAnsi="Calibri" w:eastAsia="標楷體"/>
+                <w:b/>
+                <w:sz w:val="18"/>
+              </w:rPr>
               <w:t>RECORDED BY</w:t>
             </w:r>
           </w:p>
         </w:tc>
         <w:tc>
           <w:tcPr>
-            <w:tcW w:type="dxa" w:w="2466"/>
+            <w:tcW w:type="dxa" w:w="1871"/>
             <w:vAlign w:val="center"/>
           </w:tcPr>
           <w:p>
+            <w:pPr>
+              <w:spacing w:before="20" w:after="20"/>
+              <w:jc w:val="center"/>
+            </w:pPr>
             <w:r>
               <w:rPr>
                 <w:rFonts w:ascii="Calibri" w:hAnsi="Calibri" w:eastAsia="標楷體"/>
+                <w:b w:val="0"/>
                 <w:sz w:val="20"/>
               </w:rPr>
               <w:t>Recorder Lin</w:t>
@@ -304,40 +407,52 @@
           </w:p>
         </w:tc>
       </w:tr>
-    </w:tbl>
-    <w:p>
-      <w:pPr>
-        <w:spacing w:before="120"/>
-      </w:pPr>
-      <w:r>
-        <w:rPr>
-          <w:rFonts w:ascii="Calibri" w:hAnsi="Calibri" w:eastAsia="標楷體"/>
-          <w:b/>
-          <w:sz w:val="21"/>
-          <w:u w:val="single"/>
-        </w:rPr>
-        <w:t>出席人員  Attendees</w:t>
-      </w:r>
-    </w:p>
-    <w:tbl>
-      <w:tblPr>
-        <w:tblStyle w:val="TableGrid"/>
-        <w:tblW w:type="auto" w:w="0"/>
-        <w:tblLook w:firstColumn="1" w:firstRow="1" w:lastColumn="0" w:lastRow="0" w:noHBand="0" w:noVBand="1" w:val="04A0"/>
-      </w:tblPr>
-      <w:tblGrid>
-        <w:gridCol w:w="3289"/>
-        <w:gridCol w:w="3289"/>
-        <w:gridCol w:w="3289"/>
-      </w:tblGrid>
       <w:tr>
         <w:tc>
           <w:tcPr>
-            <w:tcW w:type="dxa" w:w="3289"/>
-            <w:shd w:val="clear" w:fill="F2F2F2"/>
+            <w:tcW w:type="dxa" w:w="1644"/>
+            <w:vMerge w:val="restart"/>
             <w:vAlign w:val="center"/>
           </w:tcPr>
           <w:p>
+            <w:pPr>
+              <w:spacing w:before="20" w:after="20"/>
+              <w:jc w:val="center"/>
+            </w:pPr>
+            <w:r>
+              <w:rPr>
+                <w:rFonts w:ascii="Calibri" w:hAnsi="Calibri" w:eastAsia="標楷體"/>
+                <w:b/>
+                <w:sz w:val="18"/>
+              </w:rPr>
+              <w:t>出席人員</w:t>
+            </w:r>
+          </w:p>
+          <w:p>
+            <w:pPr>
+              <w:spacing w:before="20" w:after="20"/>
+              <w:jc w:val="center"/>
+            </w:pPr>
+            <w:r>
+              <w:rPr>
+                <w:rFonts w:ascii="Calibri" w:hAnsi="Calibri" w:eastAsia="標楷體"/>
+                <w:b/>
+                <w:sz w:val="18"/>
+              </w:rPr>
+              <w:t>ATTENDEES</w:t>
+            </w:r>
+          </w:p>
+        </w:tc>
+        <w:tc>
+          <w:tcPr>
+            <w:tcW w:type="dxa" w:w="1814"/>
+            <w:vAlign w:val="center"/>
+          </w:tcPr>
+          <w:p>
+            <w:pPr>
+              <w:spacing w:before="20" w:after="20"/>
+              <w:jc w:val="center"/>
+            </w:pPr>
             <w:r>
               <w:rPr>
                 <w:rFonts w:ascii="Calibri" w:hAnsi="Calibri" w:eastAsia="標楷體"/>
@@ -350,11 +465,14 @@
         </w:tc>
         <w:tc>
           <w:tcPr>
-            <w:tcW w:type="dxa" w:w="3289"/>
-            <w:shd w:val="clear" w:fill="F2F2F2"/>
+            <w:tcW w:type="dxa" w:w="3175"/>
             <w:vAlign w:val="center"/>
           </w:tcPr>
           <w:p>
+            <w:pPr>
+              <w:spacing w:before="20" w:after="20"/>
+              <w:jc w:val="center"/>
+            </w:pPr>
             <w:r>
               <w:rPr>
                 <w:rFonts w:ascii="Calibri" w:hAnsi="Calibri" w:eastAsia="標楷體"/>
@@ -367,11 +485,15 @@
         </w:tc>
         <w:tc>
           <w:tcPr>
-            <w:tcW w:type="dxa" w:w="3289"/>
-            <w:shd w:val="clear" w:fill="F2F2F2"/>
+            <w:tcW w:type="dxa" w:w="3232"/>
+            <w:gridSpan w:val="2"/>
             <w:vAlign w:val="center"/>
           </w:tcPr>
           <w:p>
+            <w:pPr>
+              <w:spacing w:before="20" w:after="20"/>
+              <w:jc w:val="center"/>
+            </w:pPr>
             <w:r>
               <w:rPr>
                 <w:rFonts w:ascii="Calibri" w:hAnsi="Calibri" w:eastAsia="標楷體"/>
@@ -386,13 +508,30 @@
       <w:tr>
         <w:tc>
           <w:tcPr>
-            <w:tcW w:type="dxa" w:w="3289"/>
+            <w:tcW w:type="dxa" w:w="1644"/>
+            <w:vMerge/>
           </w:tcPr>
           <w:p>
+            <w:pPr>
+              <w:spacing w:before="20" w:after="20"/>
+            </w:pPr>
+          </w:p>
+        </w:tc>
+        <w:tc>
+          <w:tcPr>
+            <w:tcW w:type="dxa" w:w="1814"/>
+            <w:vAlign w:val="center"/>
+          </w:tcPr>
+          <w:p>
+            <w:pPr>
+              <w:spacing w:before="20" w:after="20"/>
+              <w:jc w:val="center"/>
+            </w:pPr>
             <w:r>
               <w:rPr>
                 <w:rFonts w:ascii="Calibri" w:hAnsi="Calibri" w:eastAsia="標楷體"/>
-                <w:sz w:val="18"/>
+                <w:b w:val="0"/>
+                <w:sz w:val="20"/>
               </w:rPr>
               <w:t>TECO</w:t>
             </w:r>
@@ -400,13 +539,19 @@
         </w:tc>
         <w:tc>
           <w:tcPr>
-            <w:tcW w:type="dxa" w:w="3289"/>
+            <w:tcW w:type="dxa" w:w="3175"/>
+            <w:vAlign w:val="center"/>
           </w:tcPr>
           <w:p>
+            <w:pPr>
+              <w:spacing w:before="20" w:after="20"/>
+              <w:jc w:val="center"/>
+            </w:pPr>
             <w:r>
               <w:rPr>
                 <w:rFonts w:ascii="Calibri" w:hAnsi="Calibri" w:eastAsia="標楷體"/>
-                <w:sz w:val="18"/>
+                <w:b w:val="0"/>
+                <w:sz w:val="20"/>
               </w:rPr>
               <w:t>Toby Tseng</w:t>
             </w:r>
@@ -414,13 +559,20 @@
         </w:tc>
         <w:tc>
           <w:tcPr>
-            <w:tcW w:type="dxa" w:w="3289"/>
+            <w:tcW w:type="dxa" w:w="3232"/>
+            <w:gridSpan w:val="2"/>
+            <w:vAlign w:val="center"/>
           </w:tcPr>
           <w:p>
+            <w:pPr>
+              <w:spacing w:before="20" w:after="20"/>
+              <w:jc w:val="center"/>
+            </w:pPr>
             <w:r>
               <w:rPr>
                 <w:rFonts w:ascii="Calibri" w:hAnsi="Calibri" w:eastAsia="標楷體"/>
-                <w:sz w:val="18"/>
+                <w:b w:val="0"/>
+                <w:sz w:val="20"/>
               </w:rPr>
               <w:t>QAQC Manager</w:t>
             </w:r>
@@ -430,13 +582,30 @@
       <w:tr>
         <w:tc>
           <w:tcPr>
-            <w:tcW w:type="dxa" w:w="3289"/>
+            <w:tcW w:type="dxa" w:w="1644"/>
+            <w:vMerge/>
           </w:tcPr>
           <w:p>
+            <w:pPr>
+              <w:spacing w:before="20" w:after="20"/>
+            </w:pPr>
+          </w:p>
+        </w:tc>
+        <w:tc>
+          <w:tcPr>
+            <w:tcW w:type="dxa" w:w="1814"/>
+            <w:vAlign w:val="center"/>
+          </w:tcPr>
+          <w:p>
+            <w:pPr>
+              <w:spacing w:before="20" w:after="20"/>
+              <w:jc w:val="center"/>
+            </w:pPr>
             <w:r>
               <w:rPr>
                 <w:rFonts w:ascii="Calibri" w:hAnsi="Calibri" w:eastAsia="標楷體"/>
-                <w:sz w:val="18"/>
+                <w:b w:val="0"/>
+                <w:sz w:val="20"/>
               </w:rPr>
               <w:t>HL</w:t>
             </w:r>
@@ -444,13 +613,19 @@
         </w:tc>
         <w:tc>
           <w:tcPr>
-            <w:tcW w:type="dxa" w:w="3289"/>
+            <w:tcW w:type="dxa" w:w="3175"/>
+            <w:vAlign w:val="center"/>
           </w:tcPr>
           <w:p>
+            <w:pPr>
+              <w:spacing w:before="20" w:after="20"/>
+              <w:jc w:val="center"/>
+            </w:pPr>
             <w:r>
               <w:rPr>
                 <w:rFonts w:ascii="Calibri" w:hAnsi="Calibri" w:eastAsia="標楷體"/>
-                <w:sz w:val="18"/>
+                <w:b w:val="0"/>
+                <w:sz w:val="20"/>
               </w:rPr>
               <w:t>Mac Chen</w:t>
             </w:r>
@@ -458,13 +633,20 @@
         </w:tc>
         <w:tc>
           <w:tcPr>
-            <w:tcW w:type="dxa" w:w="3289"/>
+            <w:tcW w:type="dxa" w:w="3232"/>
+            <w:gridSpan w:val="2"/>
+            <w:vAlign w:val="center"/>
           </w:tcPr>
           <w:p>
+            <w:pPr>
+              <w:spacing w:before="20" w:after="20"/>
+              <w:jc w:val="center"/>
+            </w:pPr>
             <w:r>
               <w:rPr>
                 <w:rFonts w:ascii="Calibri" w:hAnsi="Calibri" w:eastAsia="標楷體"/>
-                <w:sz w:val="18"/>
+                <w:b w:val="0"/>
+                <w:sz w:val="20"/>
               </w:rPr>
               <w:t>PM</w:t>
             </w:r>
@@ -472,35 +654,20 @@
         </w:tc>
       </w:tr>
     </w:tbl>
-    <w:tbl>
-      <w:tblPr>
-        <w:tblW w:type="auto" w:w="0"/>
-        <w:tblLayout w:type="autofit"/>
-        <w:tblLook w:firstColumn="1" w:firstRow="1" w:lastColumn="0" w:lastRow="0" w:noHBand="0" w:noVBand="1" w:val="04A0"/>
-      </w:tblPr>
-      <w:tblGrid>
-        <w:gridCol w:w="9866"/>
-      </w:tblGrid>
-      <w:tr>
-        <w:tc>
-          <w:tcPr>
-            <w:tcW w:type="dxa" w:w="9866"/>
-            <w:shd w:val="clear" w:fill="D9D9D9"/>
-            <w:vAlign w:val="center"/>
-          </w:tcPr>
-          <w:p>
-            <w:r>
-              <w:rPr>
-                <w:rFonts w:ascii="Calibri" w:hAnsi="Calibri" w:eastAsia="標楷體"/>
-                <w:b/>
-                <w:sz w:val="23"/>
-              </w:rPr>
-              <w:t>2. 討論事項  Discussions / Actions</w:t>
-            </w:r>
-          </w:p>
-        </w:tc>
-      </w:tr>
-    </w:tbl>
+    <w:p>
+      <w:pPr>
+        <w:keepNext/>
+        <w:spacing w:before="200" w:after="80"/>
+      </w:pPr>
+      <w:r>
+        <w:rPr>
+          <w:rFonts w:ascii="Calibri" w:hAnsi="Calibri" w:eastAsia="標楷體"/>
+          <w:b/>
+          <w:sz w:val="23"/>
+        </w:rPr>
+        <w:t>2. 討論事項  Discussions / Actions</w:t>
+      </w:r>
+    </w:p>
     <w:tbl>
       <w:tblPr>
         <w:tblStyle w:val="TableGrid"/>
@@ -1080,36 +1247,24 @@
         </w:tc>
       </w:tr>
     </w:tbl>
-    <w:tbl>
-      <w:tblPr>
-        <w:tblW w:type="auto" w:w="0"/>
-        <w:tblLayout w:type="autofit"/>
-        <w:tblLook w:firstColumn="1" w:firstRow="1" w:lastColumn="0" w:lastRow="0" w:noHBand="0" w:noVBand="1" w:val="04A0"/>
-      </w:tblPr>
-      <w:tblGrid>
-        <w:gridCol w:w="9866"/>
-      </w:tblGrid>
-      <w:tr>
-        <w:tc>
-          <w:tcPr>
-            <w:tcW w:type="dxa" w:w="9866"/>
-            <w:shd w:val="clear" w:fill="D9D9D9"/>
-            <w:vAlign w:val="center"/>
-          </w:tcPr>
-          <w:p>
-            <w:r>
-              <w:rPr>
-                <w:rFonts w:ascii="Calibri" w:hAnsi="Calibri" w:eastAsia="標楷體"/>
-                <w:b/>
-                <w:sz w:val="23"/>
-              </w:rPr>
-              <w:t>3. 附件  Attachments</w:t>
-            </w:r>
-          </w:p>
-        </w:tc>
-      </w:tr>
-    </w:tbl>
     <w:p>
+      <w:pPr>
+        <w:keepNext/>
+        <w:spacing w:before="200" w:after="80"/>
+      </w:pPr>
+      <w:r>
+        <w:rPr>
+          <w:rFonts w:ascii="Calibri" w:hAnsi="Calibri" w:eastAsia="標楷體"/>
+          <w:b/>
+          <w:sz w:val="23"/>
+        </w:rPr>
+        <w:t>3. 附件  Attachments</w:t>
+      </w:r>
+    </w:p>
+    <w:p>
+      <w:pPr>
+        <w:spacing w:after="40"/>
+      </w:pPr>
       <w:r>
         <w:rPr>
           <w:rFonts w:ascii="Calibri" w:hAnsi="Calibri" w:eastAsia="標楷體"/>
@@ -1120,6 +1275,9 @@
       </w:r>
     </w:p>
     <w:p>
+      <w:pPr>
+        <w:spacing w:after="40"/>
+      </w:pPr>
       <w:r>
         <w:rPr>
           <w:rFonts w:ascii="Calibri" w:hAnsi="Calibri" w:eastAsia="標楷體"/>
@@ -1130,6 +1288,9 @@
       </w:r>
     </w:p>
     <w:p>
+      <w:pPr>
+        <w:spacing w:after="40"/>
+      </w:pPr>
       <w:r>
         <w:rPr>
           <w:rFonts w:ascii="Calibri" w:hAnsi="Calibri" w:eastAsia="標楷體"/>
@@ -1140,6 +1301,9 @@
       </w:r>
     </w:p>
     <w:p>
+      <w:pPr>
+        <w:spacing w:after="40"/>
+      </w:pPr>
       <w:r>
         <w:rPr>
           <w:rFonts w:ascii="Calibri" w:hAnsi="Calibri" w:eastAsia="標楷體"/>
@@ -1150,6 +1314,9 @@
       </w:r>
     </w:p>
     <w:p>
+      <w:pPr>
+        <w:spacing w:after="40"/>
+      </w:pPr>
       <w:r>
         <w:rPr>
           <w:rFonts w:ascii="Calibri" w:hAnsi="Calibri" w:eastAsia="標楷體"/>
@@ -1160,6 +1327,9 @@
       </w:r>
     </w:p>
     <w:p>
+      <w:pPr>
+        <w:spacing w:after="40"/>
+      </w:pPr>
       <w:r>
         <w:rPr>
           <w:rFonts w:ascii="Calibri" w:hAnsi="Calibri" w:eastAsia="標楷體"/>
@@ -1169,35 +1339,20 @@
         <w:t>6. agenda.pdf</w:t>
       </w:r>
     </w:p>
-    <w:tbl>
-      <w:tblPr>
-        <w:tblW w:type="auto" w:w="0"/>
-        <w:tblLayout w:type="autofit"/>
-        <w:tblLook w:firstColumn="1" w:firstRow="1" w:lastColumn="0" w:lastRow="0" w:noHBand="0" w:noVBand="1" w:val="04A0"/>
-      </w:tblPr>
-      <w:tblGrid>
-        <w:gridCol w:w="9866"/>
-      </w:tblGrid>
-      <w:tr>
-        <w:tc>
-          <w:tcPr>
-            <w:tcW w:type="dxa" w:w="9866"/>
-            <w:shd w:val="clear" w:fill="D9D9D9"/>
-            <w:vAlign w:val="center"/>
-          </w:tcPr>
-          <w:p>
-            <w:r>
-              <w:rPr>
-                <w:rFonts w:ascii="Calibri" w:hAnsi="Calibri" w:eastAsia="標楷體"/>
-                <w:b/>
-                <w:sz w:val="23"/>
-              </w:rPr>
-              <w:t>4. 簽核  Sign-off</w:t>
-            </w:r>
-          </w:p>
-        </w:tc>
-      </w:tr>
-    </w:tbl>
+    <w:p>
+      <w:pPr>
+        <w:keepNext/>
+        <w:spacing w:before="200" w:after="80"/>
+      </w:pPr>
+      <w:r>
+        <w:rPr>
+          <w:rFonts w:ascii="Calibri" w:hAnsi="Calibri" w:eastAsia="標楷體"/>
+          <w:b/>
+          <w:sz w:val="23"/>
+        </w:rPr>
+        <w:t>4. 簽核  Sign-off</w:t>
+      </w:r>
+    </w:p>
     <w:tbl>
       <w:tblPr>
         <w:tblStyle w:val="TableGrid"/>

</xml_diff>